<commit_message>
v1.1: routine checklist, crafting for every class, item icons
- Home page with live events, "to do today", season countdown and news.
- Routine as a checklist: Daily and Weekly side by side, the Shugo.GG app
  list, a line saying what each item is, Membership option.
- Crafting calculator for every class and both factions (pick the class,
  click the pieces), material list grouped by source; leaner Crafting page.
- "Where do I get it?" search, with the icon of every item (finder_icons/).
- Build share link, site settings (theme, accent colour, language, event
  reminders) in place of the game settings page.
- New look, game pictures in the tools and the text.

Co-Authored-By: Claude Opus 5.5 <noreply@anthropic.com>
</commit_message>
<xml_diff>
--- a/fontes/Progressão Aion 2 Global.docx
+++ b/fontes/Progressão Aion 2 Global.docx
@@ -6486,9 +6486,21 @@
               <w:keepNext/>
               <w:jc w:val="center"/>
             </w:pPr>
-            <w:r>
-              <w:t>—</w:t>
-            </w:r>
+            <w:sdt>
+              <w:sdtPr>
+                <w:id w:val="990001"/>
+                <w14:checkbox>
+                  <w14:checked w14:val="0"/>
+                  <w14:checkedState w14:val="2611" w14:font="Segoe UI Symbol"/>
+                  <w14:uncheckedState w14:val="2610" w14:font="Segoe UI Symbol"/>
+                </w14:checkbox>
+              </w:sdtPr>
+              <w:sdtContent>
+                <w:r>
+                  <w:t>☐</w:t>
+                </w:r>
+              </w:sdtContent>
+            </w:sdt>
           </w:p>
         </w:tc>
         <w:tc>
@@ -6502,15 +6514,7 @@
               <w:keepNext/>
             </w:pPr>
             <w:r>
-              <w:rPr>
-                <w:i/>
-                <w:iCs/>
-                <w:color w:val="6B7280"/>
-              </w:rPr>
-              <w:t>(ainda não disponível)</w:t>
-            </w:r>
-            <w:r>
-              <w:t xml:space="preserve"> 5 Genus Insight </w:t>
+              <w:t xml:space="preserve">5 Genus Insight </w:t>
             </w:r>
             <w:proofErr w:type="spellStart"/>
             <w:r>
@@ -6552,9 +6556,21 @@
               <w:pStyle w:val="TableText"/>
               <w:jc w:val="center"/>
             </w:pPr>
-            <w:r>
-              <w:t>—</w:t>
-            </w:r>
+            <w:sdt>
+              <w:sdtPr>
+                <w:id w:val="990002"/>
+                <w14:checkbox>
+                  <w14:checked w14:val="0"/>
+                  <w14:checkedState w14:val="2611" w14:font="Segoe UI Symbol"/>
+                  <w14:uncheckedState w14:val="2610" w14:font="Segoe UI Symbol"/>
+                </w14:checkbox>
+              </w:sdtPr>
+              <w:sdtContent>
+                <w:r>
+                  <w:t>☐</w:t>
+                </w:r>
+              </w:sdtContent>
+            </w:sdt>
           </w:p>
         </w:tc>
         <w:tc>
@@ -6567,15 +6583,7 @@
               <w:pStyle w:val="TableText"/>
             </w:pPr>
             <w:r>
-              <w:rPr>
-                <w:i/>
-                <w:iCs/>
-                <w:color w:val="6B7280"/>
-              </w:rPr>
-              <w:t>(ainda não disponível)</w:t>
-            </w:r>
-            <w:r>
-              <w:t xml:space="preserve"> 32 Conquistas Fire </w:t>
+              <w:t xml:space="preserve">32 Conquistas Fire </w:t>
             </w:r>
             <w:proofErr w:type="spellStart"/>
             <w:r>

</xml_diff>